<commit_message>
Update SPARK - Realtime Load Testing and Performance Validation Google Cloud Compute Engine.docx
</commit_message>
<xml_diff>
--- a/SPARK - Realtime Load Testing and Performance Validation Google Cloud Compute Engine.docx
+++ b/SPARK - Realtime Load Testing and Performance Validation Google Cloud Compute Engine.docx
@@ -26,7 +26,7 @@
                     <pic:cNvPicPr/>
                   </pic:nvPicPr>
                   <pic:blipFill>
-                    <a:blip r:embed="rId4" cstate="print">
+                    <a:blip r:embed="rId5" cstate="print">
                       <a:extLst>
                         <a:ext uri="{28A0092B-C50C-407E-A947-70E740481C1C}">
                           <a14:useLocalDpi xmlns:a14="http://schemas.microsoft.com/office/drawing/2010/main" val="0"/>
@@ -196,7 +196,7 @@
           <w:noProof/>
         </w:rPr>
         <w:drawing>
-          <wp:inline distT="0" distB="0" distL="0" distR="0" wp14:anchorId="50A9EB80" wp14:editId="0395C5AD">
+          <wp:inline distT="0" distB="0" distL="0" distR="0" wp14:anchorId="50A9EB80" wp14:editId="2E077E47">
             <wp:extent cx="5943600" cy="3145790"/>
             <wp:effectExtent l="0" t="0" r="0" b="0"/>
             <wp:docPr id="193498281" name="Picture 3"/>
@@ -211,7 +211,7 @@
                     <pic:cNvPicPr/>
                   </pic:nvPicPr>
                   <pic:blipFill>
-                    <a:blip r:embed="rId5" cstate="print">
+                    <a:blip r:embed="rId6" cstate="print">
                       <a:extLst>
                         <a:ext uri="{28A0092B-C50C-407E-A947-70E740481C1C}">
                           <a14:useLocalDpi xmlns:a14="http://schemas.microsoft.com/office/drawing/2010/main" val="0"/>
@@ -388,7 +388,7 @@
           <w:noProof/>
         </w:rPr>
         <w:drawing>
-          <wp:inline distT="0" distB="0" distL="0" distR="0" wp14:anchorId="099DBF8A" wp14:editId="13BE38CD">
+          <wp:inline distT="0" distB="0" distL="0" distR="0" wp14:anchorId="099DBF8A" wp14:editId="7B05F150">
             <wp:extent cx="5943600" cy="2917190"/>
             <wp:effectExtent l="0" t="0" r="0" b="0"/>
             <wp:docPr id="2025867175" name="Picture 1"/>
@@ -403,7 +403,7 @@
                     <pic:cNvPicPr/>
                   </pic:nvPicPr>
                   <pic:blipFill>
-                    <a:blip r:embed="rId6" cstate="print">
+                    <a:blip r:embed="rId7" cstate="print">
                       <a:extLst>
                         <a:ext uri="{28A0092B-C50C-407E-A947-70E740481C1C}">
                           <a14:useLocalDpi xmlns:a14="http://schemas.microsoft.com/office/drawing/2010/main" val="0"/>
@@ -598,7 +598,7 @@
         </w:rPr>
         <w:lastRenderedPageBreak/>
         <w:drawing>
-          <wp:inline distT="0" distB="0" distL="0" distR="0" wp14:anchorId="752B0AAA" wp14:editId="26AE9CB3">
+          <wp:inline distT="0" distB="0" distL="0" distR="0" wp14:anchorId="752B0AAA" wp14:editId="6E5CD936">
             <wp:extent cx="5943600" cy="3127375"/>
             <wp:effectExtent l="0" t="0" r="0" b="0"/>
             <wp:docPr id="209104376" name="Picture 5"/>
@@ -613,7 +613,7 @@
                     <pic:cNvPicPr/>
                   </pic:nvPicPr>
                   <pic:blipFill>
-                    <a:blip r:embed="rId7" cstate="print">
+                    <a:blip r:embed="rId8" cstate="print">
                       <a:extLst>
                         <a:ext uri="{28A0092B-C50C-407E-A947-70E740481C1C}">
                           <a14:useLocalDpi xmlns:a14="http://schemas.microsoft.com/office/drawing/2010/main" val="0"/>
@@ -809,7 +809,7 @@
                     <pic:cNvPicPr/>
                   </pic:nvPicPr>
                   <pic:blipFill>
-                    <a:blip r:embed="rId8" cstate="print">
+                    <a:blip r:embed="rId9" cstate="print">
                       <a:extLst>
                         <a:ext uri="{28A0092B-C50C-407E-A947-70E740481C1C}">
                           <a14:useLocalDpi xmlns:a14="http://schemas.microsoft.com/office/drawing/2010/main" val="0"/>
@@ -949,7 +949,7 @@
         </w:rPr>
         <w:lastRenderedPageBreak/>
         <w:drawing>
-          <wp:inline distT="0" distB="0" distL="0" distR="0" wp14:anchorId="5551266E" wp14:editId="5BEC23A4">
+          <wp:inline distT="0" distB="0" distL="0" distR="0" wp14:anchorId="5551266E" wp14:editId="151554A4">
             <wp:extent cx="5943600" cy="3153410"/>
             <wp:effectExtent l="0" t="0" r="0" b="8890"/>
             <wp:docPr id="105435277" name="Picture 8"/>
@@ -964,7 +964,7 @@
                     <pic:cNvPicPr/>
                   </pic:nvPicPr>
                   <pic:blipFill>
-                    <a:blip r:embed="rId9" cstate="print">
+                    <a:blip r:embed="rId10" cstate="print">
                       <a:extLst>
                         <a:ext uri="{28A0092B-C50C-407E-A947-70E740481C1C}">
                           <a14:useLocalDpi xmlns:a14="http://schemas.microsoft.com/office/drawing/2010/main" val="0"/>
@@ -996,7 +996,7 @@
           <w:lang w:val="nl-BE"/>
         </w:rPr>
         <w:drawing>
-          <wp:inline distT="0" distB="0" distL="0" distR="0" wp14:anchorId="2EF394E5" wp14:editId="1A0C10C5">
+          <wp:inline distT="0" distB="0" distL="0" distR="0" wp14:anchorId="2EF394E5" wp14:editId="1C3E176C">
             <wp:extent cx="5943600" cy="3120390"/>
             <wp:effectExtent l="0" t="0" r="0" b="3810"/>
             <wp:docPr id="1924476600" name="Picture 9"/>
@@ -1011,7 +1011,7 @@
                     <pic:cNvPicPr/>
                   </pic:nvPicPr>
                   <pic:blipFill>
-                    <a:blip r:embed="rId10" cstate="print">
+                    <a:blip r:embed="rId11" cstate="print">
                       <a:extLst>
                         <a:ext uri="{28A0092B-C50C-407E-A947-70E740481C1C}">
                           <a14:useLocalDpi xmlns:a14="http://schemas.microsoft.com/office/drawing/2010/main" val="0"/>
@@ -1044,7 +1044,7 @@
         </w:rPr>
         <w:lastRenderedPageBreak/>
         <w:drawing>
-          <wp:inline distT="0" distB="0" distL="0" distR="0" wp14:anchorId="5AC017BA" wp14:editId="35FBDAF7">
+          <wp:inline distT="0" distB="0" distL="0" distR="0" wp14:anchorId="5AC017BA" wp14:editId="425A460C">
             <wp:extent cx="5943600" cy="3142615"/>
             <wp:effectExtent l="0" t="0" r="0" b="635"/>
             <wp:docPr id="1450195376" name="Picture 10"/>
@@ -1059,7 +1059,7 @@
                     <pic:cNvPicPr/>
                   </pic:nvPicPr>
                   <pic:blipFill>
-                    <a:blip r:embed="rId11" cstate="print">
+                    <a:blip r:embed="rId12" cstate="print">
                       <a:extLst>
                         <a:ext uri="{28A0092B-C50C-407E-A947-70E740481C1C}">
                           <a14:useLocalDpi xmlns:a14="http://schemas.microsoft.com/office/drawing/2010/main" val="0"/>
@@ -1233,7 +1233,7 @@
           <w:lang w:val="nl-BE"/>
         </w:rPr>
         <w:drawing>
-          <wp:inline distT="0" distB="0" distL="0" distR="0" wp14:anchorId="24B122EE" wp14:editId="606AD176">
+          <wp:inline distT="0" distB="0" distL="0" distR="0" wp14:anchorId="24B122EE" wp14:editId="1DFE5D9E">
             <wp:extent cx="5943600" cy="3152775"/>
             <wp:effectExtent l="0" t="0" r="0" b="9525"/>
             <wp:docPr id="1467600177" name="Picture 11"/>
@@ -1248,7 +1248,7 @@
                     <pic:cNvPicPr/>
                   </pic:nvPicPr>
                   <pic:blipFill>
-                    <a:blip r:embed="rId12" cstate="print">
+                    <a:blip r:embed="rId13" cstate="print">
                       <a:extLst>
                         <a:ext uri="{28A0092B-C50C-407E-A947-70E740481C1C}">
                           <a14:useLocalDpi xmlns:a14="http://schemas.microsoft.com/office/drawing/2010/main" val="0"/>
@@ -1465,7 +1465,7 @@
           <w:lang w:val="nl-BE"/>
         </w:rPr>
         <w:drawing>
-          <wp:inline distT="0" distB="0" distL="0" distR="0" wp14:anchorId="4FAE4C2A" wp14:editId="5187C3AE">
+          <wp:inline distT="0" distB="0" distL="0" distR="0" wp14:anchorId="4FAE4C2A" wp14:editId="71607F3E">
             <wp:extent cx="5943600" cy="3131820"/>
             <wp:effectExtent l="0" t="0" r="0" b="0"/>
             <wp:docPr id="580718456" name="Picture 12"/>
@@ -1480,7 +1480,7 @@
                     <pic:cNvPicPr/>
                   </pic:nvPicPr>
                   <pic:blipFill>
-                    <a:blip r:embed="rId13" cstate="print">
+                    <a:blip r:embed="rId14" cstate="print">
                       <a:extLst>
                         <a:ext uri="{28A0092B-C50C-407E-A947-70E740481C1C}">
                           <a14:useLocalDpi xmlns:a14="http://schemas.microsoft.com/office/drawing/2010/main" val="0"/>
@@ -1571,7 +1571,7 @@
         </w:rPr>
         <w:lastRenderedPageBreak/>
         <w:drawing>
-          <wp:inline distT="0" distB="0" distL="0" distR="0" wp14:anchorId="78DA59B5" wp14:editId="09A6729E">
+          <wp:inline distT="0" distB="0" distL="0" distR="0" wp14:anchorId="78DA59B5" wp14:editId="5CE25194">
             <wp:extent cx="5943600" cy="3007360"/>
             <wp:effectExtent l="0" t="0" r="0" b="2540"/>
             <wp:docPr id="1614923620" name="Picture 13"/>
@@ -1586,7 +1586,7 @@
                     <pic:cNvPicPr/>
                   </pic:nvPicPr>
                   <pic:blipFill>
-                    <a:blip r:embed="rId14" cstate="print">
+                    <a:blip r:embed="rId15" cstate="print">
                       <a:extLst>
                         <a:ext uri="{28A0092B-C50C-407E-A947-70E740481C1C}">
                           <a14:useLocalDpi xmlns:a14="http://schemas.microsoft.com/office/drawing/2010/main" val="0"/>
@@ -1831,7 +1831,7 @@
         </w:rPr>
         <w:lastRenderedPageBreak/>
         <w:drawing>
-          <wp:inline distT="0" distB="0" distL="0" distR="0" wp14:anchorId="1233AC08" wp14:editId="6CB57DC2">
+          <wp:inline distT="0" distB="0" distL="0" distR="0" wp14:anchorId="1233AC08" wp14:editId="47E5FB31">
             <wp:extent cx="5943600" cy="3192780"/>
             <wp:effectExtent l="0" t="0" r="0" b="7620"/>
             <wp:docPr id="1591203044" name="Picture 14"/>
@@ -1846,7 +1846,7 @@
                     <pic:cNvPicPr/>
                   </pic:nvPicPr>
                   <pic:blipFill>
-                    <a:blip r:embed="rId15" cstate="print">
+                    <a:blip r:embed="rId16" cstate="print">
                       <a:extLst>
                         <a:ext uri="{28A0092B-C50C-407E-A947-70E740481C1C}">
                           <a14:useLocalDpi xmlns:a14="http://schemas.microsoft.com/office/drawing/2010/main" val="0"/>
@@ -2020,7 +2020,7 @@
           <w:lang w:val="nl-BE"/>
         </w:rPr>
         <w:drawing>
-          <wp:inline distT="0" distB="0" distL="0" distR="0" wp14:anchorId="195BF5EF" wp14:editId="2C5C51A9">
+          <wp:inline distT="0" distB="0" distL="0" distR="0" wp14:anchorId="195BF5EF" wp14:editId="389F0740">
             <wp:extent cx="5943600" cy="2947035"/>
             <wp:effectExtent l="0" t="0" r="0" b="5715"/>
             <wp:docPr id="1404369209" name="Picture 15"/>
@@ -2035,7 +2035,7 @@
                     <pic:cNvPicPr/>
                   </pic:nvPicPr>
                   <pic:blipFill>
-                    <a:blip r:embed="rId16" cstate="print">
+                    <a:blip r:embed="rId17" cstate="print">
                       <a:extLst>
                         <a:ext uri="{28A0092B-C50C-407E-A947-70E740481C1C}">
                           <a14:useLocalDpi xmlns:a14="http://schemas.microsoft.com/office/drawing/2010/main" val="0"/>
@@ -2190,6 +2190,231 @@
           <w:lang w:val="nl-BE"/>
         </w:rPr>
       </w:pPr>
+      <w:r>
+        <w:rPr>
+          <w:lang w:val="nl-BE"/>
+        </w:rPr>
+        <w:drawing>
+          <wp:inline distT="0" distB="0" distL="0" distR="0" wp14:anchorId="2CD35250" wp14:editId="6063A35B">
+            <wp:extent cx="5943600" cy="6073140"/>
+            <wp:effectExtent l="0" t="0" r="0" b="3810"/>
+            <wp:docPr id="935211550" name="Picture 2"/>
+            <wp:cNvGraphicFramePr>
+              <a:graphicFrameLocks xmlns:a="http://schemas.openxmlformats.org/drawingml/2006/main" noChangeAspect="1"/>
+            </wp:cNvGraphicFramePr>
+            <a:graphic xmlns:a="http://schemas.openxmlformats.org/drawingml/2006/main">
+              <a:graphicData uri="http://schemas.openxmlformats.org/drawingml/2006/picture">
+                <pic:pic xmlns:pic="http://schemas.openxmlformats.org/drawingml/2006/picture">
+                  <pic:nvPicPr>
+                    <pic:cNvPr id="0" name="Picture 1"/>
+                    <pic:cNvPicPr>
+                      <a:picLocks noChangeAspect="1" noChangeArrowheads="1"/>
+                    </pic:cNvPicPr>
+                  </pic:nvPicPr>
+                  <pic:blipFill>
+                    <a:blip r:embed="rId18">
+                      <a:extLst>
+                        <a:ext uri="{28A0092B-C50C-407E-A947-70E740481C1C}">
+                          <a14:useLocalDpi xmlns:a14="http://schemas.microsoft.com/office/drawing/2010/main" val="0"/>
+                        </a:ext>
+                      </a:extLst>
+                    </a:blip>
+                    <a:srcRect/>
+                    <a:stretch>
+                      <a:fillRect/>
+                    </a:stretch>
+                  </pic:blipFill>
+                  <pic:spPr bwMode="auto">
+                    <a:xfrm>
+                      <a:off x="0" y="0"/>
+                      <a:ext cx="5943600" cy="6073140"/>
+                    </a:xfrm>
+                    <a:prstGeom prst="rect">
+                      <a:avLst/>
+                    </a:prstGeom>
+                    <a:noFill/>
+                    <a:ln>
+                      <a:noFill/>
+                    </a:ln>
+                  </pic:spPr>
+                </pic:pic>
+              </a:graphicData>
+            </a:graphic>
+          </wp:inline>
+        </w:drawing>
+      </w:r>
+    </w:p>
+    <w:p>
+      <w:pPr>
+        <w:jc w:val="both"/>
+      </w:pPr>
+      <w:r>
+        <w:lastRenderedPageBreak/>
+        <w:t>We configured a Google Cloud NAT gateway to provide outbound internet access for private VM instances (dc2-spark, dc3-spark, dc4-spark) that only use internal IP addresses inside the VPC network.</w:t>
+      </w:r>
+    </w:p>
+    <w:p>
+      <w:pPr>
+        <w:jc w:val="both"/>
+      </w:pPr>
+      <w:r>
+        <w:t>Without Cloud NAT, these internal VMs could communicate only inside the private network and were unable to download packages, install Spark dependencies, or access external repositories such as archive.apache.org.</w:t>
+      </w:r>
+    </w:p>
+    <w:p>
+      <w:pPr>
+        <w:jc w:val="both"/>
+      </w:pPr>
+      <w:r>
+        <w:t>Configuration details:</w:t>
+      </w:r>
+    </w:p>
+    <w:p>
+      <w:pPr>
+        <w:numPr>
+          <w:ilvl w:val="0"/>
+          <w:numId w:val="1"/>
+        </w:numPr>
+        <w:jc w:val="both"/>
+      </w:pPr>
+      <w:r>
+        <w:t xml:space="preserve">NAT Gateway Name: </w:t>
+      </w:r>
+      <w:proofErr w:type="spellStart"/>
+      <w:r>
+        <w:t>eurovision-nat</w:t>
+      </w:r>
+      <w:proofErr w:type="spellEnd"/>
+      <w:r>
+        <w:t xml:space="preserve"> </w:t>
+      </w:r>
+    </w:p>
+    <w:p>
+      <w:pPr>
+        <w:numPr>
+          <w:ilvl w:val="0"/>
+          <w:numId w:val="1"/>
+        </w:numPr>
+        <w:jc w:val="both"/>
+      </w:pPr>
+      <w:r>
+        <w:t xml:space="preserve">Network: default </w:t>
+      </w:r>
+    </w:p>
+    <w:p>
+      <w:pPr>
+        <w:numPr>
+          <w:ilvl w:val="0"/>
+          <w:numId w:val="1"/>
+        </w:numPr>
+        <w:jc w:val="both"/>
+      </w:pPr>
+      <w:r>
+        <w:t xml:space="preserve">Region: europe-west1 </w:t>
+      </w:r>
+    </w:p>
+    <w:p>
+      <w:pPr>
+        <w:numPr>
+          <w:ilvl w:val="0"/>
+          <w:numId w:val="1"/>
+        </w:numPr>
+        <w:jc w:val="both"/>
+      </w:pPr>
+      <w:r>
+        <w:t xml:space="preserve">Cloud Router: </w:t>
+      </w:r>
+      <w:proofErr w:type="spellStart"/>
+      <w:r>
+        <w:t>eurovision</w:t>
+      </w:r>
+      <w:proofErr w:type="spellEnd"/>
+      <w:r>
+        <w:t xml:space="preserve">-router </w:t>
+      </w:r>
+    </w:p>
+    <w:p>
+      <w:pPr>
+        <w:numPr>
+          <w:ilvl w:val="0"/>
+          <w:numId w:val="1"/>
+        </w:numPr>
+        <w:jc w:val="both"/>
+      </w:pPr>
+      <w:r>
+        <w:t xml:space="preserve">NAT Type: Public </w:t>
+      </w:r>
+    </w:p>
+    <w:p>
+      <w:pPr>
+        <w:jc w:val="both"/>
+      </w:pPr>
+      <w:r>
+        <w:t>This approach was chosen because:</w:t>
+      </w:r>
+    </w:p>
+    <w:p>
+      <w:pPr>
+        <w:numPr>
+          <w:ilvl w:val="0"/>
+          <w:numId w:val="2"/>
+        </w:numPr>
+        <w:jc w:val="both"/>
+      </w:pPr>
+      <w:r>
+        <w:t xml:space="preserve">Only dc1-spark uses an external IP for administration access. </w:t>
+      </w:r>
+    </w:p>
+    <w:p>
+      <w:pPr>
+        <w:numPr>
+          <w:ilvl w:val="0"/>
+          <w:numId w:val="2"/>
+        </w:numPr>
+        <w:jc w:val="both"/>
+      </w:pPr>
+      <w:r>
+        <w:t xml:space="preserve">dc2, dc3, and dc4 remain private and more secure by using only internal IP addresses. </w:t>
+      </w:r>
+    </w:p>
+    <w:p>
+      <w:pPr>
+        <w:numPr>
+          <w:ilvl w:val="0"/>
+          <w:numId w:val="2"/>
+        </w:numPr>
+        <w:jc w:val="both"/>
+      </w:pPr>
+      <w:r>
+        <w:t xml:space="preserve">Cloud NAT allows secure outbound internet connectivity without exposing the VMs directly to inbound internet traffic. </w:t>
+      </w:r>
+    </w:p>
+    <w:p>
+      <w:pPr>
+        <w:numPr>
+          <w:ilvl w:val="0"/>
+          <w:numId w:val="2"/>
+        </w:numPr>
+        <w:jc w:val="both"/>
+      </w:pPr>
+      <w:r>
+        <w:t>All Spark nodes can now install software and dependencies while remaining inside the internal Google Cloud network architecture.</w:t>
+      </w:r>
+    </w:p>
+    <w:p>
+      <w:pPr>
+        <w:jc w:val="both"/>
+      </w:pPr>
+    </w:p>
+    <w:p>
+      <w:pPr>
+        <w:jc w:val="both"/>
+      </w:pPr>
+    </w:p>
+    <w:p>
+      <w:pPr>
+        <w:jc w:val="both"/>
+      </w:pPr>
     </w:p>
     <w:sectPr>
       <w:pgSz w:w="12240" w:h="15840"/>
@@ -2199,6 +2424,333 @@
     </w:sectPr>
   </w:body>
 </w:document>
+</file>
+
+<file path=word/numbering.xml><?xml version="1.0" encoding="utf-8"?>
+<w:numbering xmlns:wpc="http://schemas.microsoft.com/office/word/2010/wordprocessingCanvas" xmlns:cx="http://schemas.microsoft.com/office/drawing/2014/chartex" xmlns:cx1="http://schemas.microsoft.com/office/drawing/2015/9/8/chartex" xmlns:cx2="http://schemas.microsoft.com/office/drawing/2015/10/21/chartex" xmlns:cx3="http://schemas.microsoft.com/office/drawing/2016/5/9/chartex" xmlns:cx4="http://schemas.microsoft.com/office/drawing/2016/5/10/chartex" xmlns:cx5="http://schemas.microsoft.com/office/drawing/2016/5/11/chartex" xmlns:cx6="http://schemas.microsoft.com/office/drawing/2016/5/12/chartex" xmlns:cx7="http://schemas.microsoft.com/office/drawing/2016/5/13/chartex" xmlns:cx8="http://schemas.microsoft.com/office/drawing/2016/5/14/chartex" xmlns:mc="http://schemas.openxmlformats.org/markup-compatibility/2006" xmlns:aink="http://schemas.microsoft.com/office/drawing/2016/ink" xmlns:am3d="http://schemas.microsoft.com/office/drawing/2017/model3d" xmlns:o="urn:schemas-microsoft-com:office:office" xmlns:oel="http://schemas.microsoft.com/office/2019/extlst" xmlns:r="http://schemas.openxmlformats.org/officeDocument/2006/relationships" xmlns:m="http://schemas.openxmlformats.org/officeDocument/2006/math" xmlns:v="urn:schemas-microsoft-com:vml" xmlns:wp14="http://schemas.microsoft.com/office/word/2010/wordprocessingDrawing" xmlns:wp="http://schemas.openxmlformats.org/drawingml/2006/wordprocessingDrawing" xmlns:w10="urn:schemas-microsoft-com:office:word" xmlns:w="http://schemas.openxmlformats.org/wordprocessingml/2006/main" xmlns:w14="http://schemas.microsoft.com/office/word/2010/wordml" xmlns:w15="http://schemas.microsoft.com/office/word/2012/wordml" xmlns:w16cex="http://schemas.microsoft.com/office/word/2018/wordml/cex" xmlns:w16cid="http://schemas.microsoft.com/office/word/2016/wordml/cid" xmlns:w16="http://schemas.microsoft.com/office/word/2018/wordml" xmlns:w16du="http://schemas.microsoft.com/office/word/2023/wordml/word16du" xmlns:w16sdtdh="http://schemas.microsoft.com/office/word/2020/wordml/sdtdatahash" xmlns:w16sdtfl="http://schemas.microsoft.com/office/word/2024/wordml/sdtformatlock" xmlns:w16se="http://schemas.microsoft.com/office/word/2015/wordml/symex" xmlns:wpg="http://schemas.microsoft.com/office/word/2010/wordprocessingGroup" xmlns:wpi="http://schemas.microsoft.com/office/word/2010/wordprocessingInk" xmlns:wne="http://schemas.microsoft.com/office/word/2006/wordml" xmlns:wps="http://schemas.microsoft.com/office/word/2010/wordprocessingShape" mc:Ignorable="w14 w15 w16se w16cid w16 w16cex w16sdtdh w16sdtfl w16du wp14">
+  <w:abstractNum w:abstractNumId="0" w15:restartNumberingAfterBreak="0">
+    <w:nsid w:val="158957C9"/>
+    <w:multiLevelType w:val="multilevel"/>
+    <w:tmpl w:val="2294F4D2"/>
+    <w:lvl w:ilvl="0">
+      <w:start w:val="1"/>
+      <w:numFmt w:val="bullet"/>
+      <w:lvlText w:val=""/>
+      <w:lvlJc w:val="left"/>
+      <w:pPr>
+        <w:tabs>
+          <w:tab w:val="num" w:pos="720"/>
+        </w:tabs>
+        <w:ind w:left="720" w:hanging="360"/>
+      </w:pPr>
+      <w:rPr>
+        <w:rFonts w:ascii="Symbol" w:hAnsi="Symbol" w:hint="default"/>
+        <w:sz w:val="20"/>
+      </w:rPr>
+    </w:lvl>
+    <w:lvl w:ilvl="1">
+      <w:start w:val="1"/>
+      <w:numFmt w:val="bullet"/>
+      <w:lvlText w:val="o"/>
+      <w:lvlJc w:val="left"/>
+      <w:pPr>
+        <w:tabs>
+          <w:tab w:val="num" w:pos="1440"/>
+        </w:tabs>
+        <w:ind w:left="1440" w:hanging="360"/>
+      </w:pPr>
+      <w:rPr>
+        <w:rFonts w:ascii="Courier New" w:hAnsi="Courier New" w:cs="Times New Roman" w:hint="default"/>
+        <w:sz w:val="20"/>
+      </w:rPr>
+    </w:lvl>
+    <w:lvl w:ilvl="2">
+      <w:start w:val="1"/>
+      <w:numFmt w:val="bullet"/>
+      <w:lvlText w:val=""/>
+      <w:lvlJc w:val="left"/>
+      <w:pPr>
+        <w:tabs>
+          <w:tab w:val="num" w:pos="2160"/>
+        </w:tabs>
+        <w:ind w:left="2160" w:hanging="360"/>
+      </w:pPr>
+      <w:rPr>
+        <w:rFonts w:ascii="Wingdings" w:hAnsi="Wingdings" w:hint="default"/>
+        <w:sz w:val="20"/>
+      </w:rPr>
+    </w:lvl>
+    <w:lvl w:ilvl="3">
+      <w:start w:val="1"/>
+      <w:numFmt w:val="bullet"/>
+      <w:lvlText w:val=""/>
+      <w:lvlJc w:val="left"/>
+      <w:pPr>
+        <w:tabs>
+          <w:tab w:val="num" w:pos="2880"/>
+        </w:tabs>
+        <w:ind w:left="2880" w:hanging="360"/>
+      </w:pPr>
+      <w:rPr>
+        <w:rFonts w:ascii="Wingdings" w:hAnsi="Wingdings" w:hint="default"/>
+        <w:sz w:val="20"/>
+      </w:rPr>
+    </w:lvl>
+    <w:lvl w:ilvl="4">
+      <w:start w:val="1"/>
+      <w:numFmt w:val="bullet"/>
+      <w:lvlText w:val=""/>
+      <w:lvlJc w:val="left"/>
+      <w:pPr>
+        <w:tabs>
+          <w:tab w:val="num" w:pos="3600"/>
+        </w:tabs>
+        <w:ind w:left="3600" w:hanging="360"/>
+      </w:pPr>
+      <w:rPr>
+        <w:rFonts w:ascii="Wingdings" w:hAnsi="Wingdings" w:hint="default"/>
+        <w:sz w:val="20"/>
+      </w:rPr>
+    </w:lvl>
+    <w:lvl w:ilvl="5">
+      <w:start w:val="1"/>
+      <w:numFmt w:val="bullet"/>
+      <w:lvlText w:val=""/>
+      <w:lvlJc w:val="left"/>
+      <w:pPr>
+        <w:tabs>
+          <w:tab w:val="num" w:pos="4320"/>
+        </w:tabs>
+        <w:ind w:left="4320" w:hanging="360"/>
+      </w:pPr>
+      <w:rPr>
+        <w:rFonts w:ascii="Wingdings" w:hAnsi="Wingdings" w:hint="default"/>
+        <w:sz w:val="20"/>
+      </w:rPr>
+    </w:lvl>
+    <w:lvl w:ilvl="6">
+      <w:start w:val="1"/>
+      <w:numFmt w:val="bullet"/>
+      <w:lvlText w:val=""/>
+      <w:lvlJc w:val="left"/>
+      <w:pPr>
+        <w:tabs>
+          <w:tab w:val="num" w:pos="5040"/>
+        </w:tabs>
+        <w:ind w:left="5040" w:hanging="360"/>
+      </w:pPr>
+      <w:rPr>
+        <w:rFonts w:ascii="Wingdings" w:hAnsi="Wingdings" w:hint="default"/>
+        <w:sz w:val="20"/>
+      </w:rPr>
+    </w:lvl>
+    <w:lvl w:ilvl="7">
+      <w:start w:val="1"/>
+      <w:numFmt w:val="bullet"/>
+      <w:lvlText w:val=""/>
+      <w:lvlJc w:val="left"/>
+      <w:pPr>
+        <w:tabs>
+          <w:tab w:val="num" w:pos="5760"/>
+        </w:tabs>
+        <w:ind w:left="5760" w:hanging="360"/>
+      </w:pPr>
+      <w:rPr>
+        <w:rFonts w:ascii="Wingdings" w:hAnsi="Wingdings" w:hint="default"/>
+        <w:sz w:val="20"/>
+      </w:rPr>
+    </w:lvl>
+    <w:lvl w:ilvl="8">
+      <w:start w:val="1"/>
+      <w:numFmt w:val="bullet"/>
+      <w:lvlText w:val=""/>
+      <w:lvlJc w:val="left"/>
+      <w:pPr>
+        <w:tabs>
+          <w:tab w:val="num" w:pos="6480"/>
+        </w:tabs>
+        <w:ind w:left="6480" w:hanging="360"/>
+      </w:pPr>
+      <w:rPr>
+        <w:rFonts w:ascii="Wingdings" w:hAnsi="Wingdings" w:hint="default"/>
+        <w:sz w:val="20"/>
+      </w:rPr>
+    </w:lvl>
+  </w:abstractNum>
+  <w:abstractNum w:abstractNumId="1" w15:restartNumberingAfterBreak="0">
+    <w:nsid w:val="4C047C3A"/>
+    <w:multiLevelType w:val="multilevel"/>
+    <w:tmpl w:val="1A8025C4"/>
+    <w:lvl w:ilvl="0">
+      <w:start w:val="1"/>
+      <w:numFmt w:val="bullet"/>
+      <w:lvlText w:val=""/>
+      <w:lvlJc w:val="left"/>
+      <w:pPr>
+        <w:tabs>
+          <w:tab w:val="num" w:pos="720"/>
+        </w:tabs>
+        <w:ind w:left="720" w:hanging="360"/>
+      </w:pPr>
+      <w:rPr>
+        <w:rFonts w:ascii="Symbol" w:hAnsi="Symbol" w:hint="default"/>
+        <w:sz w:val="20"/>
+      </w:rPr>
+    </w:lvl>
+    <w:lvl w:ilvl="1">
+      <w:start w:val="1"/>
+      <w:numFmt w:val="bullet"/>
+      <w:lvlText w:val="o"/>
+      <w:lvlJc w:val="left"/>
+      <w:pPr>
+        <w:tabs>
+          <w:tab w:val="num" w:pos="1440"/>
+        </w:tabs>
+        <w:ind w:left="1440" w:hanging="360"/>
+      </w:pPr>
+      <w:rPr>
+        <w:rFonts w:ascii="Courier New" w:hAnsi="Courier New" w:cs="Times New Roman" w:hint="default"/>
+        <w:sz w:val="20"/>
+      </w:rPr>
+    </w:lvl>
+    <w:lvl w:ilvl="2">
+      <w:start w:val="1"/>
+      <w:numFmt w:val="bullet"/>
+      <w:lvlText w:val=""/>
+      <w:lvlJc w:val="left"/>
+      <w:pPr>
+        <w:tabs>
+          <w:tab w:val="num" w:pos="2160"/>
+        </w:tabs>
+        <w:ind w:left="2160" w:hanging="360"/>
+      </w:pPr>
+      <w:rPr>
+        <w:rFonts w:ascii="Wingdings" w:hAnsi="Wingdings" w:hint="default"/>
+        <w:sz w:val="20"/>
+      </w:rPr>
+    </w:lvl>
+    <w:lvl w:ilvl="3">
+      <w:start w:val="1"/>
+      <w:numFmt w:val="bullet"/>
+      <w:lvlText w:val=""/>
+      <w:lvlJc w:val="left"/>
+      <w:pPr>
+        <w:tabs>
+          <w:tab w:val="num" w:pos="2880"/>
+        </w:tabs>
+        <w:ind w:left="2880" w:hanging="360"/>
+      </w:pPr>
+      <w:rPr>
+        <w:rFonts w:ascii="Wingdings" w:hAnsi="Wingdings" w:hint="default"/>
+        <w:sz w:val="20"/>
+      </w:rPr>
+    </w:lvl>
+    <w:lvl w:ilvl="4">
+      <w:start w:val="1"/>
+      <w:numFmt w:val="bullet"/>
+      <w:lvlText w:val=""/>
+      <w:lvlJc w:val="left"/>
+      <w:pPr>
+        <w:tabs>
+          <w:tab w:val="num" w:pos="3600"/>
+        </w:tabs>
+        <w:ind w:left="3600" w:hanging="360"/>
+      </w:pPr>
+      <w:rPr>
+        <w:rFonts w:ascii="Wingdings" w:hAnsi="Wingdings" w:hint="default"/>
+        <w:sz w:val="20"/>
+      </w:rPr>
+    </w:lvl>
+    <w:lvl w:ilvl="5">
+      <w:start w:val="1"/>
+      <w:numFmt w:val="bullet"/>
+      <w:lvlText w:val=""/>
+      <w:lvlJc w:val="left"/>
+      <w:pPr>
+        <w:tabs>
+          <w:tab w:val="num" w:pos="4320"/>
+        </w:tabs>
+        <w:ind w:left="4320" w:hanging="360"/>
+      </w:pPr>
+      <w:rPr>
+        <w:rFonts w:ascii="Wingdings" w:hAnsi="Wingdings" w:hint="default"/>
+        <w:sz w:val="20"/>
+      </w:rPr>
+    </w:lvl>
+    <w:lvl w:ilvl="6">
+      <w:start w:val="1"/>
+      <w:numFmt w:val="bullet"/>
+      <w:lvlText w:val=""/>
+      <w:lvlJc w:val="left"/>
+      <w:pPr>
+        <w:tabs>
+          <w:tab w:val="num" w:pos="5040"/>
+        </w:tabs>
+        <w:ind w:left="5040" w:hanging="360"/>
+      </w:pPr>
+      <w:rPr>
+        <w:rFonts w:ascii="Wingdings" w:hAnsi="Wingdings" w:hint="default"/>
+        <w:sz w:val="20"/>
+      </w:rPr>
+    </w:lvl>
+    <w:lvl w:ilvl="7">
+      <w:start w:val="1"/>
+      <w:numFmt w:val="bullet"/>
+      <w:lvlText w:val=""/>
+      <w:lvlJc w:val="left"/>
+      <w:pPr>
+        <w:tabs>
+          <w:tab w:val="num" w:pos="5760"/>
+        </w:tabs>
+        <w:ind w:left="5760" w:hanging="360"/>
+      </w:pPr>
+      <w:rPr>
+        <w:rFonts w:ascii="Wingdings" w:hAnsi="Wingdings" w:hint="default"/>
+        <w:sz w:val="20"/>
+      </w:rPr>
+    </w:lvl>
+    <w:lvl w:ilvl="8">
+      <w:start w:val="1"/>
+      <w:numFmt w:val="bullet"/>
+      <w:lvlText w:val=""/>
+      <w:lvlJc w:val="left"/>
+      <w:pPr>
+        <w:tabs>
+          <w:tab w:val="num" w:pos="6480"/>
+        </w:tabs>
+        <w:ind w:left="6480" w:hanging="360"/>
+      </w:pPr>
+      <w:rPr>
+        <w:rFonts w:ascii="Wingdings" w:hAnsi="Wingdings" w:hint="default"/>
+        <w:sz w:val="20"/>
+      </w:rPr>
+    </w:lvl>
+  </w:abstractNum>
+  <w:num w:numId="1" w16cid:durableId="841505020">
+    <w:abstractNumId w:val="0"/>
+    <w:lvlOverride w:ilvl="0"/>
+    <w:lvlOverride w:ilvl="1"/>
+    <w:lvlOverride w:ilvl="2"/>
+    <w:lvlOverride w:ilvl="3"/>
+    <w:lvlOverride w:ilvl="4"/>
+    <w:lvlOverride w:ilvl="5"/>
+    <w:lvlOverride w:ilvl="6"/>
+    <w:lvlOverride w:ilvl="7"/>
+    <w:lvlOverride w:ilvl="8"/>
+  </w:num>
+  <w:num w:numId="2" w16cid:durableId="93407951">
+    <w:abstractNumId w:val="1"/>
+    <w:lvlOverride w:ilvl="0"/>
+    <w:lvlOverride w:ilvl="1"/>
+    <w:lvlOverride w:ilvl="2"/>
+    <w:lvlOverride w:ilvl="3"/>
+    <w:lvlOverride w:ilvl="4"/>
+    <w:lvlOverride w:ilvl="5"/>
+    <w:lvlOverride w:ilvl="6"/>
+    <w:lvlOverride w:ilvl="7"/>
+    <w:lvlOverride w:ilvl="8"/>
+  </w:num>
+</w:numbering>
 </file>
 
 <file path=word/styles.xml><?xml version="1.0" encoding="utf-8"?>

</xml_diff>

<commit_message>
SPARK - Realtime Load Testing and Performance Validation Google Cloud Compute Engine
</commit_message>
<xml_diff>
--- a/SPARK - Realtime Load Testing and Performance Validation Google Cloud Compute Engine.docx
+++ b/SPARK - Realtime Load Testing and Performance Validation Google Cloud Compute Engine.docx
@@ -196,7 +196,7 @@
           <w:noProof/>
         </w:rPr>
         <w:drawing>
-          <wp:inline distT="0" distB="0" distL="0" distR="0" wp14:anchorId="50A9EB80" wp14:editId="2E077E47">
+          <wp:inline distT="0" distB="0" distL="0" distR="0" wp14:anchorId="50A9EB80" wp14:editId="2D1B3C0F">
             <wp:extent cx="5943600" cy="3145790"/>
             <wp:effectExtent l="0" t="0" r="0" b="0"/>
             <wp:docPr id="193498281" name="Picture 3"/>
@@ -388,7 +388,7 @@
           <w:noProof/>
         </w:rPr>
         <w:drawing>
-          <wp:inline distT="0" distB="0" distL="0" distR="0" wp14:anchorId="099DBF8A" wp14:editId="7B05F150">
+          <wp:inline distT="0" distB="0" distL="0" distR="0" wp14:anchorId="099DBF8A" wp14:editId="4F7DEDDE">
             <wp:extent cx="5943600" cy="2917190"/>
             <wp:effectExtent l="0" t="0" r="0" b="0"/>
             <wp:docPr id="2025867175" name="Picture 1"/>
@@ -598,7 +598,7 @@
         </w:rPr>
         <w:lastRenderedPageBreak/>
         <w:drawing>
-          <wp:inline distT="0" distB="0" distL="0" distR="0" wp14:anchorId="752B0AAA" wp14:editId="6E5CD936">
+          <wp:inline distT="0" distB="0" distL="0" distR="0" wp14:anchorId="752B0AAA" wp14:editId="07833466">
             <wp:extent cx="5943600" cy="3127375"/>
             <wp:effectExtent l="0" t="0" r="0" b="0"/>
             <wp:docPr id="209104376" name="Picture 5"/>
@@ -949,7 +949,7 @@
         </w:rPr>
         <w:lastRenderedPageBreak/>
         <w:drawing>
-          <wp:inline distT="0" distB="0" distL="0" distR="0" wp14:anchorId="5551266E" wp14:editId="151554A4">
+          <wp:inline distT="0" distB="0" distL="0" distR="0" wp14:anchorId="5551266E" wp14:editId="06445BD2">
             <wp:extent cx="5943600" cy="3153410"/>
             <wp:effectExtent l="0" t="0" r="0" b="8890"/>
             <wp:docPr id="105435277" name="Picture 8"/>
@@ -996,7 +996,7 @@
           <w:lang w:val="nl-BE"/>
         </w:rPr>
         <w:drawing>
-          <wp:inline distT="0" distB="0" distL="0" distR="0" wp14:anchorId="2EF394E5" wp14:editId="1C3E176C">
+          <wp:inline distT="0" distB="0" distL="0" distR="0" wp14:anchorId="2EF394E5" wp14:editId="1DFCCCAA">
             <wp:extent cx="5943600" cy="3120390"/>
             <wp:effectExtent l="0" t="0" r="0" b="3810"/>
             <wp:docPr id="1924476600" name="Picture 9"/>
@@ -1044,7 +1044,7 @@
         </w:rPr>
         <w:lastRenderedPageBreak/>
         <w:drawing>
-          <wp:inline distT="0" distB="0" distL="0" distR="0" wp14:anchorId="5AC017BA" wp14:editId="425A460C">
+          <wp:inline distT="0" distB="0" distL="0" distR="0" wp14:anchorId="5AC017BA" wp14:editId="7E51AA3C">
             <wp:extent cx="5943600" cy="3142615"/>
             <wp:effectExtent l="0" t="0" r="0" b="635"/>
             <wp:docPr id="1450195376" name="Picture 10"/>
@@ -1233,7 +1233,7 @@
           <w:lang w:val="nl-BE"/>
         </w:rPr>
         <w:drawing>
-          <wp:inline distT="0" distB="0" distL="0" distR="0" wp14:anchorId="24B122EE" wp14:editId="1DFE5D9E">
+          <wp:inline distT="0" distB="0" distL="0" distR="0" wp14:anchorId="24B122EE" wp14:editId="53F52322">
             <wp:extent cx="5943600" cy="3152775"/>
             <wp:effectExtent l="0" t="0" r="0" b="9525"/>
             <wp:docPr id="1467600177" name="Picture 11"/>
@@ -1465,7 +1465,7 @@
           <w:lang w:val="nl-BE"/>
         </w:rPr>
         <w:drawing>
-          <wp:inline distT="0" distB="0" distL="0" distR="0" wp14:anchorId="4FAE4C2A" wp14:editId="71607F3E">
+          <wp:inline distT="0" distB="0" distL="0" distR="0" wp14:anchorId="4FAE4C2A" wp14:editId="7B7BB5AA">
             <wp:extent cx="5943600" cy="3131820"/>
             <wp:effectExtent l="0" t="0" r="0" b="0"/>
             <wp:docPr id="580718456" name="Picture 12"/>
@@ -1571,7 +1571,7 @@
         </w:rPr>
         <w:lastRenderedPageBreak/>
         <w:drawing>
-          <wp:inline distT="0" distB="0" distL="0" distR="0" wp14:anchorId="78DA59B5" wp14:editId="5CE25194">
+          <wp:inline distT="0" distB="0" distL="0" distR="0" wp14:anchorId="78DA59B5" wp14:editId="39F4B2CA">
             <wp:extent cx="5943600" cy="3007360"/>
             <wp:effectExtent l="0" t="0" r="0" b="2540"/>
             <wp:docPr id="1614923620" name="Picture 13"/>
@@ -1831,7 +1831,7 @@
         </w:rPr>
         <w:lastRenderedPageBreak/>
         <w:drawing>
-          <wp:inline distT="0" distB="0" distL="0" distR="0" wp14:anchorId="1233AC08" wp14:editId="47E5FB31">
+          <wp:inline distT="0" distB="0" distL="0" distR="0" wp14:anchorId="1233AC08" wp14:editId="4FD859AA">
             <wp:extent cx="5943600" cy="3192780"/>
             <wp:effectExtent l="0" t="0" r="0" b="7620"/>
             <wp:docPr id="1591203044" name="Picture 14"/>
@@ -2020,7 +2020,7 @@
           <w:lang w:val="nl-BE"/>
         </w:rPr>
         <w:drawing>
-          <wp:inline distT="0" distB="0" distL="0" distR="0" wp14:anchorId="195BF5EF" wp14:editId="389F0740">
+          <wp:inline distT="0" distB="0" distL="0" distR="0" wp14:anchorId="195BF5EF" wp14:editId="79871FB5">
             <wp:extent cx="5943600" cy="2947035"/>
             <wp:effectExtent l="0" t="0" r="0" b="5715"/>
             <wp:docPr id="1404369209" name="Picture 15"/>
@@ -2192,6 +2192,7 @@
       </w:pPr>
       <w:r>
         <w:rPr>
+          <w:noProof/>
           <w:lang w:val="nl-BE"/>
         </w:rPr>
         <w:drawing>
@@ -2271,10 +2272,7 @@
     </w:p>
     <w:p>
       <w:pPr>
-        <w:numPr>
-          <w:ilvl w:val="0"/>
-          <w:numId w:val="1"/>
-        </w:numPr>
+        <w:ind w:left="720"/>
         <w:jc w:val="both"/>
       </w:pPr>
       <w:r>
@@ -2291,10 +2289,7 @@
     </w:p>
     <w:p>
       <w:pPr>
-        <w:numPr>
-          <w:ilvl w:val="0"/>
-          <w:numId w:val="1"/>
-        </w:numPr>
+        <w:ind w:left="720"/>
         <w:jc w:val="both"/>
       </w:pPr>
       <w:r>
@@ -2303,10 +2298,7 @@
     </w:p>
     <w:p>
       <w:pPr>
-        <w:numPr>
-          <w:ilvl w:val="0"/>
-          <w:numId w:val="1"/>
-        </w:numPr>
+        <w:ind w:left="720"/>
         <w:jc w:val="both"/>
       </w:pPr>
       <w:r>
@@ -2315,10 +2307,7 @@
     </w:p>
     <w:p>
       <w:pPr>
-        <w:numPr>
-          <w:ilvl w:val="0"/>
-          <w:numId w:val="1"/>
-        </w:numPr>
+        <w:ind w:left="720"/>
         <w:jc w:val="both"/>
       </w:pPr>
       <w:r>
@@ -2335,10 +2324,7 @@
     </w:p>
     <w:p>
       <w:pPr>
-        <w:numPr>
-          <w:ilvl w:val="0"/>
-          <w:numId w:val="1"/>
-        </w:numPr>
+        <w:ind w:left="720"/>
         <w:jc w:val="both"/>
       </w:pPr>
       <w:r>
@@ -2355,10 +2341,7 @@
     </w:p>
     <w:p>
       <w:pPr>
-        <w:numPr>
-          <w:ilvl w:val="0"/>
-          <w:numId w:val="2"/>
-        </w:numPr>
+        <w:ind w:left="720"/>
         <w:jc w:val="both"/>
       </w:pPr>
       <w:r>
@@ -2367,10 +2350,7 @@
     </w:p>
     <w:p>
       <w:pPr>
-        <w:numPr>
-          <w:ilvl w:val="0"/>
-          <w:numId w:val="2"/>
-        </w:numPr>
+        <w:ind w:left="720"/>
         <w:jc w:val="both"/>
       </w:pPr>
       <w:r>
@@ -2379,10 +2359,7 @@
     </w:p>
     <w:p>
       <w:pPr>
-        <w:numPr>
-          <w:ilvl w:val="0"/>
-          <w:numId w:val="2"/>
-        </w:numPr>
+        <w:ind w:left="720"/>
         <w:jc w:val="both"/>
       </w:pPr>
       <w:r>
@@ -2391,10 +2368,7 @@
     </w:p>
     <w:p>
       <w:pPr>
-        <w:numPr>
-          <w:ilvl w:val="0"/>
-          <w:numId w:val="2"/>
-        </w:numPr>
+        <w:ind w:left="720"/>
         <w:jc w:val="both"/>
       </w:pPr>
       <w:r>
@@ -2728,27 +2702,9 @@
   </w:abstractNum>
   <w:num w:numId="1" w16cid:durableId="841505020">
     <w:abstractNumId w:val="0"/>
-    <w:lvlOverride w:ilvl="0"/>
-    <w:lvlOverride w:ilvl="1"/>
-    <w:lvlOverride w:ilvl="2"/>
-    <w:lvlOverride w:ilvl="3"/>
-    <w:lvlOverride w:ilvl="4"/>
-    <w:lvlOverride w:ilvl="5"/>
-    <w:lvlOverride w:ilvl="6"/>
-    <w:lvlOverride w:ilvl="7"/>
-    <w:lvlOverride w:ilvl="8"/>
   </w:num>
   <w:num w:numId="2" w16cid:durableId="93407951">
     <w:abstractNumId w:val="1"/>
-    <w:lvlOverride w:ilvl="0"/>
-    <w:lvlOverride w:ilvl="1"/>
-    <w:lvlOverride w:ilvl="2"/>
-    <w:lvlOverride w:ilvl="3"/>
-    <w:lvlOverride w:ilvl="4"/>
-    <w:lvlOverride w:ilvl="5"/>
-    <w:lvlOverride w:ilvl="6"/>
-    <w:lvlOverride w:ilvl="7"/>
-    <w:lvlOverride w:ilvl="8"/>
   </w:num>
 </w:numbering>
 </file>
@@ -3356,6 +3312,7 @@
   <w:style w:type="character" w:default="1" w:styleId="DefaultParagraphFont">
     <w:name w:val="Default Paragraph Font"/>
     <w:uiPriority w:val="1"/>
+    <w:semiHidden/>
     <w:unhideWhenUsed/>
   </w:style>
   <w:style w:type="table" w:default="1" w:styleId="TableNormal">

</xml_diff>